<commit_message>
Add LaTeX report documenting the full methodology and results
Covers data preparation, EDA, the five tuned models and stacking
ensemble, August 2026 forecasts, Evidently monitoring and RunPod
deployment, with a marked placeholder for the RunPod screenshots.
The study guide checklist and README now point to the report.

Co-Authored-By: Claude Opus 5.5 <noreply@anthropic.com>
Claude-Session: https://claude.ai/code/session_01SsZmJweGM4Pqwx33iLZ8jr
</commit_message>
<xml_diff>
--- a/deliverables/AirQo_PM25_Study_Guide.docx
+++ b/deliverables/AirQo_PM25_Study_Guide.docx
@@ -19542,7 +19542,7 @@
                 <w:sz w:val="19"/>
                 <w:szCs w:val="19"/>
               </w:rPr>
-              <w:t xml:space="preserve">–</w:t>
+              <w:t xml:space="preserve">report/AirQo_PM25_Report.tex (+ compiled PDF)</w:t>
             </w:r>
           </w:p>
         </w:tc>
@@ -19567,6 +19567,13 @@
             <w:pPr>
               <w:spacing w:after="20"/>
             </w:pPr>
+            <w:r>
+              <w:rPr>
+                <w:sz w:val="19"/>
+                <w:szCs w:val="19"/>
+              </w:rPr>
+              <w:t xml:space="preserve">Done. </w:t>
+            </w:r>
             <w:r>
               <w:rPr>
                 <w:b/>
@@ -19574,14 +19581,7 @@
                 <w:sz w:val="19"/>
                 <w:szCs w:val="19"/>
               </w:rPr>
-              <w:t xml:space="preserve">Not produced yet: required by the brief</w:t>
-            </w:r>
-            <w:r>
-              <w:rPr>
-                <w:sz w:val="19"/>
-                <w:szCs w:val="19"/>
-              </w:rPr>
-              <w:t xml:space="preserve"> (this guide and the notebook contain all the content)</w:t>
+              <w:t xml:space="preserve">Add the RunPod screenshots in the yellow box of Section 8 and recompile</w:t>
             </w:r>
           </w:p>
         </w:tc>

</xml_diff>